<commit_message>
Clarify private sharing access
</commit_message>
<xml_diff>
--- a/public/downloads/密盾传输系统使用手册.docx
+++ b/public/downloads/密盾传输系统使用手册.docx
@@ -1512,12 +1512,12 @@
         <w:keepLines/>
       </w:pPr>
       <w:r>
-        <w:t>点击“确认共享”。成功后，文件会出现在对方的“共享给我”页面。共享行为同时写入安全审计日志。</w:t>
+        <w:t>点击“确认共享”。成功后，文件会出现在对方的“共享给我”页面。共享行为同时写入安全审计日志。若网站采用私密发布，管理员还需要把收件人加入网站访问名单。</w:t>
       </w:r>
     </w:p>
     <w:p>
       <w:r>
-        <w:t>共享并不会生成公开下载链接。每次下载都要求收件人处于登录状态，并在服务端实时检查收件邮箱和到期时间。</w:t>
+        <w:t>共享并不会生成公开下载链接。每次下载都要求收件人处于登录状态，并在服务端实时检查网站访问资格、收件邮箱和到期时间。</w:t>
       </w:r>
     </w:p>
     <w:p>
@@ -1542,7 +1542,7 @@
         <w:keepLines/>
       </w:pPr>
       <w:r>
-        <w:t>收件人必须使用共享时填写的邮箱登录。如果使用其他账号，即使知道文件编号也不能下载。</w:t>
+        <w:t>收件人必须先获得网站访问资格，再使用共享时填写的邮箱登录。如果使用其他账号，即使知道文件编号也不能下载。</w:t>
       </w:r>
     </w:p>
     <w:p>

</xml_diff>

<commit_message>
Improve sharing controls and security validation
</commit_message>
<xml_diff>
--- a/public/downloads/密盾传输系统使用手册.docx
+++ b/public/downloads/密盾传输系统使用手册.docx
@@ -221,7 +221,7 @@
         <w:jc w:val="center"/>
       </w:pPr>
       <w:r>
-        <w:t>本手册说明系统的登录、加密上传、授权共享、下载校验、审计查询和维护方法。按照本文步骤操作，即可完成一次可验证的安全文件传输。</w:t>
+        <w:t>本手册说明系统的登录、加密上传、授权共享、授权撤销、下载校验、审计查询和维护方法。按照本文步骤操作，即可完成一次可验证、可控制的安全文件传输。</w:t>
       </w:r>
     </w:p>
     <w:p>
@@ -576,7 +576,7 @@
               <w:rPr>
                 <w:sz w:val="21"/>
               </w:rPr>
-              <w:t>上传、下载、共享、删除</w:t>
+              <w:t>上传 下载 共享 撤销 删除</w:t>
             </w:r>
           </w:p>
         </w:tc>
@@ -727,7 +727,7 @@
               <w:rPr>
                 <w:sz w:val="21"/>
               </w:rPr>
-              <w:t>查看操作结果和时间</w:t>
+              <w:t>查看操作账号 结果和时间</w:t>
             </w:r>
           </w:p>
         </w:tc>
@@ -752,7 +752,7 @@
               <w:rPr>
                 <w:sz w:val="21"/>
               </w:rPr>
-              <w:t>按当前用户隔离记录</w:t>
+              <w:t>本人及所属文件范围</w:t>
             </w:r>
           </w:p>
         </w:tc>
@@ -859,7 +859,7 @@
         <w:keepLines/>
       </w:pPr>
       <w:r>
-        <w:t>推荐使用最新版 Chrome、Edge 或 Firefox。浏览器必须允许 JavaScript 和必要的 Cookie。演示版单个文件最大 15 MB，支持 PDF、Word、Excel、图片、压缩包和纯文本等常见类型。</w:t>
+        <w:t>推荐使用 Chrome、Edge 或 Firefox，浏览器须启用 JavaScript 和 Cookie。演示版单文件最大 15 MB、单账户最多 5 GB，支持 PDF、Word、Excel、图片、压缩包和纯文本等常见类型。</w:t>
       </w:r>
     </w:p>
     <w:p>
@@ -1516,6 +1516,23 @@
       </w:r>
     </w:p>
     <w:p>
+      <w:pPr>
+        <w:pStyle w:val="Heading2"/>
+        <w:keepNext/>
+      </w:pPr>
+      <w:r>
+        <w:t>5.5  管理或撤销授权</w:t>
+      </w:r>
+    </w:p>
+    <w:p>
+      <w:pPr>
+        <w:keepLines/>
+      </w:pPr>
+      <w:r>
+        <w:t>进入“我的文件”，在“当前有效授权”区域查看文件名、收件邮箱、到期时间和下载次数。点击“撤销”并确认后，该收件人会立即失去下载权限，系统同时记录撤销事件。</w:t>
+      </w:r>
+    </w:p>
+    <w:p>
       <w:r>
         <w:t>共享并不会生成公开下载链接。每次下载都要求收件人处于登录状态，并在服务端实时检查网站访问资格、收件邮箱和到期时间。</w:t>
       </w:r>
@@ -1589,7 +1606,7 @@
     </w:p>
     <w:p>
       <w:r>
-        <w:t>点击“安全日志”可以查看当前用户的操作历史。日志包含操作类型、结果、说明和时间，适合在答辩中证明系统具有可追溯性。</w:t>
+        <w:t>点击“安全日志”可以查看本人操作以及自己所拥有文件的相关活动。日志包含操作类型、操作账号、结果、说明和时间，适合在答辩中证明系统具有可追溯性。</w:t>
       </w:r>
     </w:p>
     <w:tbl>
@@ -1860,6 +1877,81 @@
               <w:rPr>
                 <w:sz w:val="21"/>
               </w:rPr>
+              <w:t>撤销授权</w:t>
+            </w:r>
+          </w:p>
+        </w:tc>
+        <w:tc>
+          <w:tcPr>
+            <w:tcW w:type="dxa" w:w="3384"/>
+            <w:vAlign w:val="center"/>
+            <w:tcMar>
+              <w:top w:w="110" w:type="dxa"/>
+              <w:start w:w="120" w:type="dxa"/>
+              <w:bottom w:w="110" w:type="dxa"/>
+              <w:end w:w="120" w:type="dxa"/>
+            </w:tcMar>
+          </w:tcPr>
+          <w:p>
+            <w:pPr>
+              <w:spacing w:after="0"/>
+              <w:jc w:val="left"/>
+            </w:pPr>
+            <w:r>
+              <w:rPr>
+                <w:sz w:val="21"/>
+              </w:rPr>
+              <w:t>所有者提前取消共享</w:t>
+            </w:r>
+          </w:p>
+        </w:tc>
+        <w:tc>
+          <w:tcPr>
+            <w:tcW w:type="dxa" w:w="3528"/>
+            <w:vAlign w:val="center"/>
+            <w:tcMar>
+              <w:top w:w="110" w:type="dxa"/>
+              <w:start w:w="120" w:type="dxa"/>
+              <w:bottom w:w="110" w:type="dxa"/>
+              <w:end w:w="120" w:type="dxa"/>
+            </w:tcMar>
+          </w:tcPr>
+          <w:p>
+            <w:pPr>
+              <w:spacing w:after="0"/>
+              <w:jc w:val="left"/>
+            </w:pPr>
+            <w:r>
+              <w:rPr>
+                <w:sz w:val="21"/>
+              </w:rPr>
+              <w:t>收件人与撤销时间</w:t>
+            </w:r>
+          </w:p>
+        </w:tc>
+      </w:tr>
+      <w:tr>
+        <w:tc>
+          <w:tcPr>
+            <w:tcW w:type="dxa" w:w="2088"/>
+            <w:vAlign w:val="center"/>
+            <w:tcMar>
+              <w:top w:w="110" w:type="dxa"/>
+              <w:start w:w="120" w:type="dxa"/>
+              <w:bottom w:w="110" w:type="dxa"/>
+              <w:end w:w="120" w:type="dxa"/>
+            </w:tcMar>
+            <w:shd w:fill="F1F7FA"/>
+          </w:tcPr>
+          <w:p>
+            <w:pPr>
+              <w:spacing w:after="0"/>
+              <w:jc w:val="center"/>
+            </w:pPr>
+            <w:r>
+              <w:rPr>
+                <w:sz w:val="21"/>
+              </w:rPr>
               <w:t>解密下载</w:t>
             </w:r>
           </w:p>
@@ -1874,6 +1966,7 @@
               <w:bottom w:w="110" w:type="dxa"/>
               <w:end w:w="120" w:type="dxa"/>
             </w:tcMar>
+            <w:shd w:fill="F1F7FA"/>
           </w:tcPr>
           <w:p>
             <w:pPr>
@@ -1898,6 +1991,7 @@
               <w:bottom w:w="110" w:type="dxa"/>
               <w:end w:w="120" w:type="dxa"/>
             </w:tcMar>
+            <w:shd w:fill="F1F7FA"/>
           </w:tcPr>
           <w:p>
             <w:pPr>
@@ -1924,7 +2018,6 @@
               <w:bottom w:w="110" w:type="dxa"/>
               <w:end w:w="120" w:type="dxa"/>
             </w:tcMar>
-            <w:shd w:fill="F1F7FA"/>
           </w:tcPr>
           <w:p>
             <w:pPr>
@@ -1949,7 +2042,6 @@
               <w:bottom w:w="110" w:type="dxa"/>
               <w:end w:w="120" w:type="dxa"/>
             </w:tcMar>
-            <w:shd w:fill="F1F7FA"/>
           </w:tcPr>
           <w:p>
             <w:pPr>
@@ -1974,7 +2066,6 @@
               <w:bottom w:w="110" w:type="dxa"/>
               <w:end w:w="120" w:type="dxa"/>
             </w:tcMar>
-            <w:shd w:fill="F1F7FA"/>
           </w:tcPr>
           <w:p>
             <w:pPr>
@@ -2001,6 +2092,7 @@
               <w:bottom w:w="110" w:type="dxa"/>
               <w:end w:w="120" w:type="dxa"/>
             </w:tcMar>
+            <w:shd w:fill="F1F7FA"/>
           </w:tcPr>
           <w:p>
             <w:pPr>
@@ -2025,6 +2117,7 @@
               <w:bottom w:w="110" w:type="dxa"/>
               <w:end w:w="120" w:type="dxa"/>
             </w:tcMar>
+            <w:shd w:fill="F1F7FA"/>
           </w:tcPr>
           <w:p>
             <w:pPr>
@@ -2049,6 +2142,7 @@
               <w:bottom w:w="110" w:type="dxa"/>
               <w:end w:w="120" w:type="dxa"/>
             </w:tcMar>
+            <w:shd w:fill="F1F7FA"/>
           </w:tcPr>
           <w:p>
             <w:pPr>
@@ -2790,7 +2884,21 @@
     </w:p>
     <w:p>
       <w:r>
-        <w:t>当前演示版限制 15 MB。论文扩展可采用分块加密、断点续传和分块认证标签。</w:t>
+        <w:t>当前演示版限制单文件 15 MB、单账户 5 GB。论文扩展可采用分块加密、断点续传和分块认证标签。</w:t>
+      </w:r>
+    </w:p>
+    <w:p>
+      <w:pPr>
+        <w:pStyle w:val="Heading3"/>
+        <w:keepNext/>
+      </w:pPr>
+      <w:r>
+        <w:t>如何提前停止共享</w:t>
+      </w:r>
+    </w:p>
+    <w:p>
+      <w:r>
+        <w:t>进入“我的文件”，在“当前有效授权”中找到对应收件人，点击“撤销”并确认。</w:t>
       </w:r>
     </w:p>
     <w:p>
@@ -3263,7 +3371,7 @@
               <w:rPr>
                 <w:sz w:val="21"/>
               </w:rPr>
-              <w:t>演示过期或错误账号访问</w:t>
+              <w:t>账号 A 查看下载次数并撤销</w:t>
             </w:r>
           </w:p>
         </w:tc>
@@ -3287,7 +3395,7 @@
               <w:rPr>
                 <w:sz w:val="21"/>
               </w:rPr>
-              <w:t>越权访问被拒绝</w:t>
+              <w:t>实时权限控制和撤销审计</w:t>
             </w:r>
           </w:p>
         </w:tc>
@@ -3339,6 +3447,81 @@
               <w:rPr>
                 <w:sz w:val="21"/>
               </w:rPr>
+              <w:t>账号 B 再次尝试下载</w:t>
+            </w:r>
+          </w:p>
+        </w:tc>
+        <w:tc>
+          <w:tcPr>
+            <w:tcW w:type="dxa" w:w="4536"/>
+            <w:vAlign w:val="center"/>
+            <w:tcMar>
+              <w:top w:w="110" w:type="dxa"/>
+              <w:start w:w="120" w:type="dxa"/>
+              <w:bottom w:w="110" w:type="dxa"/>
+              <w:end w:w="120" w:type="dxa"/>
+            </w:tcMar>
+            <w:shd w:fill="F1F7FA"/>
+          </w:tcPr>
+          <w:p>
+            <w:pPr>
+              <w:spacing w:after="0"/>
+              <w:jc w:val="left"/>
+            </w:pPr>
+            <w:r>
+              <w:rPr>
+                <w:sz w:val="21"/>
+              </w:rPr>
+              <w:t>已撤销权限立即被拒绝</w:t>
+            </w:r>
+          </w:p>
+        </w:tc>
+      </w:tr>
+      <w:tr>
+        <w:tc>
+          <w:tcPr>
+            <w:tcW w:type="dxa" w:w="936"/>
+            <w:vAlign w:val="center"/>
+            <w:tcMar>
+              <w:top w:w="110" w:type="dxa"/>
+              <w:start w:w="120" w:type="dxa"/>
+              <w:bottom w:w="110" w:type="dxa"/>
+              <w:end w:w="120" w:type="dxa"/>
+            </w:tcMar>
+          </w:tcPr>
+          <w:p>
+            <w:pPr>
+              <w:spacing w:after="0"/>
+              <w:jc w:val="center"/>
+            </w:pPr>
+            <w:r>
+              <w:rPr>
+                <w:sz w:val="21"/>
+              </w:rPr>
+              <w:t>7</w:t>
+            </w:r>
+          </w:p>
+        </w:tc>
+        <w:tc>
+          <w:tcPr>
+            <w:tcW w:type="dxa" w:w="3528"/>
+            <w:vAlign w:val="center"/>
+            <w:tcMar>
+              <w:top w:w="110" w:type="dxa"/>
+              <w:start w:w="120" w:type="dxa"/>
+              <w:bottom w:w="110" w:type="dxa"/>
+              <w:end w:w="120" w:type="dxa"/>
+            </w:tcMar>
+          </w:tcPr>
+          <w:p>
+            <w:pPr>
+              <w:spacing w:after="0"/>
+              <w:jc w:val="left"/>
+            </w:pPr>
+            <w:r>
+              <w:rPr>
+                <w:sz w:val="21"/>
+              </w:rPr>
               <w:t>删除文件并刷新列表</w:t>
             </w:r>
           </w:p>
@@ -3353,7 +3536,6 @@
               <w:bottom w:w="110" w:type="dxa"/>
               <w:end w:w="120" w:type="dxa"/>
             </w:tcMar>
-            <w:shd w:fill="F1F7FA"/>
           </w:tcPr>
           <w:p>
             <w:pPr>
@@ -3416,9 +3598,9 @@
             <w:vAlign w:val="center"/>
             <w:shd w:fill="123B52"/>
             <w:tcMar>
-              <w:top w:w="110" w:type="dxa"/>
+              <w:top w:w="75" w:type="dxa"/>
               <w:start w:w="120" w:type="dxa"/>
-              <w:bottom w:w="110" w:type="dxa"/>
+              <w:bottom w:w="75" w:type="dxa"/>
               <w:end w:w="120" w:type="dxa"/>
             </w:tcMar>
           </w:tcPr>
@@ -3442,9 +3624,9 @@
             <w:vAlign w:val="center"/>
             <w:shd w:fill="123B52"/>
             <w:tcMar>
-              <w:top w:w="110" w:type="dxa"/>
+              <w:top w:w="75" w:type="dxa"/>
               <w:start w:w="120" w:type="dxa"/>
-              <w:bottom w:w="110" w:type="dxa"/>
+              <w:bottom w:w="75" w:type="dxa"/>
               <w:end w:w="120" w:type="dxa"/>
             </w:tcMar>
           </w:tcPr>
@@ -3468,9 +3650,9 @@
             <w:vAlign w:val="center"/>
             <w:shd w:fill="123B52"/>
             <w:tcMar>
-              <w:top w:w="110" w:type="dxa"/>
+              <w:top w:w="75" w:type="dxa"/>
               <w:start w:w="120" w:type="dxa"/>
-              <w:bottom w:w="110" w:type="dxa"/>
+              <w:bottom w:w="75" w:type="dxa"/>
               <w:end w:w="120" w:type="dxa"/>
             </w:tcMar>
           </w:tcPr>
@@ -3495,9 +3677,9 @@
             <w:tcW w:type="dxa" w:w="2232"/>
             <w:vAlign w:val="center"/>
             <w:tcMar>
-              <w:top w:w="110" w:type="dxa"/>
+              <w:top w:w="75" w:type="dxa"/>
               <w:start w:w="120" w:type="dxa"/>
-              <w:bottom w:w="110" w:type="dxa"/>
+              <w:bottom w:w="75" w:type="dxa"/>
               <w:end w:w="120" w:type="dxa"/>
             </w:tcMar>
           </w:tcPr>
@@ -3519,9 +3701,9 @@
             <w:tcW w:type="dxa" w:w="3384"/>
             <w:vAlign w:val="center"/>
             <w:tcMar>
-              <w:top w:w="110" w:type="dxa"/>
+              <w:top w:w="75" w:type="dxa"/>
               <w:start w:w="120" w:type="dxa"/>
-              <w:bottom w:w="110" w:type="dxa"/>
+              <w:bottom w:w="75" w:type="dxa"/>
               <w:end w:w="120" w:type="dxa"/>
             </w:tcMar>
           </w:tcPr>
@@ -3543,9 +3725,9 @@
             <w:tcW w:type="dxa" w:w="3384"/>
             <w:vAlign w:val="center"/>
             <w:tcMar>
-              <w:top w:w="110" w:type="dxa"/>
+              <w:top w:w="75" w:type="dxa"/>
               <w:start w:w="120" w:type="dxa"/>
-              <w:bottom w:w="110" w:type="dxa"/>
+              <w:bottom w:w="75" w:type="dxa"/>
               <w:end w:w="120" w:type="dxa"/>
             </w:tcMar>
           </w:tcPr>
@@ -3569,9 +3751,9 @@
             <w:tcW w:type="dxa" w:w="2232"/>
             <w:vAlign w:val="center"/>
             <w:tcMar>
-              <w:top w:w="110" w:type="dxa"/>
+              <w:top w:w="75" w:type="dxa"/>
               <w:start w:w="120" w:type="dxa"/>
-              <w:bottom w:w="110" w:type="dxa"/>
+              <w:bottom w:w="75" w:type="dxa"/>
               <w:end w:w="120" w:type="dxa"/>
             </w:tcMar>
             <w:shd w:fill="F1F7FA"/>
@@ -3594,9 +3776,9 @@
             <w:tcW w:type="dxa" w:w="3384"/>
             <w:vAlign w:val="center"/>
             <w:tcMar>
-              <w:top w:w="110" w:type="dxa"/>
+              <w:top w:w="75" w:type="dxa"/>
               <w:start w:w="120" w:type="dxa"/>
-              <w:bottom w:w="110" w:type="dxa"/>
+              <w:bottom w:w="75" w:type="dxa"/>
               <w:end w:w="120" w:type="dxa"/>
             </w:tcMar>
             <w:shd w:fill="F1F7FA"/>
@@ -3619,9 +3801,9 @@
             <w:tcW w:type="dxa" w:w="3384"/>
             <w:vAlign w:val="center"/>
             <w:tcMar>
-              <w:top w:w="110" w:type="dxa"/>
+              <w:top w:w="75" w:type="dxa"/>
               <w:start w:w="120" w:type="dxa"/>
-              <w:bottom w:w="110" w:type="dxa"/>
+              <w:bottom w:w="75" w:type="dxa"/>
               <w:end w:w="120" w:type="dxa"/>
             </w:tcMar>
             <w:shd w:fill="F1F7FA"/>
@@ -3646,9 +3828,9 @@
             <w:tcW w:type="dxa" w:w="2232"/>
             <w:vAlign w:val="center"/>
             <w:tcMar>
-              <w:top w:w="110" w:type="dxa"/>
+              <w:top w:w="75" w:type="dxa"/>
               <w:start w:w="120" w:type="dxa"/>
-              <w:bottom w:w="110" w:type="dxa"/>
+              <w:bottom w:w="75" w:type="dxa"/>
               <w:end w:w="120" w:type="dxa"/>
             </w:tcMar>
           </w:tcPr>
@@ -3670,9 +3852,9 @@
             <w:tcW w:type="dxa" w:w="3384"/>
             <w:vAlign w:val="center"/>
             <w:tcMar>
-              <w:top w:w="110" w:type="dxa"/>
+              <w:top w:w="75" w:type="dxa"/>
               <w:start w:w="120" w:type="dxa"/>
-              <w:bottom w:w="110" w:type="dxa"/>
+              <w:bottom w:w="75" w:type="dxa"/>
               <w:end w:w="120" w:type="dxa"/>
             </w:tcMar>
           </w:tcPr>
@@ -3694,9 +3876,9 @@
             <w:tcW w:type="dxa" w:w="3384"/>
             <w:vAlign w:val="center"/>
             <w:tcMar>
-              <w:top w:w="110" w:type="dxa"/>
+              <w:top w:w="75" w:type="dxa"/>
               <w:start w:w="120" w:type="dxa"/>
-              <w:bottom w:w="110" w:type="dxa"/>
+              <w:bottom w:w="75" w:type="dxa"/>
               <w:end w:w="120" w:type="dxa"/>
             </w:tcMar>
           </w:tcPr>
@@ -3720,9 +3902,9 @@
             <w:tcW w:type="dxa" w:w="2232"/>
             <w:vAlign w:val="center"/>
             <w:tcMar>
-              <w:top w:w="110" w:type="dxa"/>
+              <w:top w:w="75" w:type="dxa"/>
               <w:start w:w="120" w:type="dxa"/>
-              <w:bottom w:w="110" w:type="dxa"/>
+              <w:bottom w:w="75" w:type="dxa"/>
               <w:end w:w="120" w:type="dxa"/>
             </w:tcMar>
             <w:shd w:fill="F1F7FA"/>
@@ -3745,9 +3927,9 @@
             <w:tcW w:type="dxa" w:w="3384"/>
             <w:vAlign w:val="center"/>
             <w:tcMar>
-              <w:top w:w="110" w:type="dxa"/>
+              <w:top w:w="75" w:type="dxa"/>
               <w:start w:w="120" w:type="dxa"/>
-              <w:bottom w:w="110" w:type="dxa"/>
+              <w:bottom w:w="75" w:type="dxa"/>
               <w:end w:w="120" w:type="dxa"/>
             </w:tcMar>
             <w:shd w:fill="F1F7FA"/>
@@ -3770,9 +3952,9 @@
             <w:tcW w:type="dxa" w:w="3384"/>
             <w:vAlign w:val="center"/>
             <w:tcMar>
-              <w:top w:w="110" w:type="dxa"/>
+              <w:top w:w="75" w:type="dxa"/>
               <w:start w:w="120" w:type="dxa"/>
-              <w:bottom w:w="110" w:type="dxa"/>
+              <w:bottom w:w="75" w:type="dxa"/>
               <w:end w:w="120" w:type="dxa"/>
             </w:tcMar>
             <w:shd w:fill="F1F7FA"/>
@@ -3797,9 +3979,9 @@
             <w:tcW w:type="dxa" w:w="2232"/>
             <w:vAlign w:val="center"/>
             <w:tcMar>
-              <w:top w:w="110" w:type="dxa"/>
+              <w:top w:w="75" w:type="dxa"/>
               <w:start w:w="120" w:type="dxa"/>
-              <w:bottom w:w="110" w:type="dxa"/>
+              <w:bottom w:w="75" w:type="dxa"/>
               <w:end w:w="120" w:type="dxa"/>
             </w:tcMar>
           </w:tcPr>
@@ -3821,9 +4003,9 @@
             <w:tcW w:type="dxa" w:w="3384"/>
             <w:vAlign w:val="center"/>
             <w:tcMar>
-              <w:top w:w="110" w:type="dxa"/>
+              <w:top w:w="75" w:type="dxa"/>
               <w:start w:w="120" w:type="dxa"/>
-              <w:bottom w:w="110" w:type="dxa"/>
+              <w:bottom w:w="75" w:type="dxa"/>
               <w:end w:w="120" w:type="dxa"/>
             </w:tcMar>
           </w:tcPr>
@@ -3845,9 +4027,9 @@
             <w:tcW w:type="dxa" w:w="3384"/>
             <w:vAlign w:val="center"/>
             <w:tcMar>
-              <w:top w:w="110" w:type="dxa"/>
+              <w:top w:w="75" w:type="dxa"/>
               <w:start w:w="120" w:type="dxa"/>
-              <w:bottom w:w="110" w:type="dxa"/>
+              <w:bottom w:w="75" w:type="dxa"/>
               <w:end w:w="120" w:type="dxa"/>
             </w:tcMar>
           </w:tcPr>
@@ -3867,18 +4049,13 @@
       </w:tr>
     </w:tbl>
     <w:p>
-      <w:pPr>
-        <w:spacing w:after="0"/>
-      </w:pPr>
-    </w:p>
-    <w:p>
       <w:r>
-        <w:t>更换 RSA 密钥前必须制定密钥轮换方案。直接替换私钥会导致旧文件无法解密。可在扩展版本中为密钥增加版本号，并保留仍有文件引用的历史私钥。</w:t>
+        <w:t>更换 RSA 私钥会导致旧文件无法解密，因此必须规划密钥版本，并保留仍被文件引用的历史私钥。</w:t>
       </w:r>
     </w:p>
     <w:p>
       <w:r>
-        <w:t>部署完成后先访问健康检查接口，再使用测试账号完成一次上传、共享和下载闭环。确认数据库、对象存储、身份头和密钥环境变量全部生效后，方可用于正式演示。</w:t>
+        <w:t>部署后访问健康检查接口，并用测试账号完成上传、共享、撤销和下载闭环，确认各项配置生效。</w:t>
       </w:r>
     </w:p>
     <w:sectPr>

</xml_diff>

<commit_message>
Harden audit consistency and health checks
</commit_message>
<xml_diff>
--- a/public/downloads/密盾传输系统使用手册.docx
+++ b/public/downloads/密盾传输系统使用手册.docx
@@ -2103,7 +2103,7 @@
               <w:rPr>
                 <w:sz w:val="21"/>
               </w:rPr>
-              <w:t>上传或下载失败</w:t>
+              <w:t>操作失败</w:t>
             </w:r>
           </w:p>
         </w:tc>
@@ -2128,7 +2128,7 @@
               <w:rPr>
                 <w:sz w:val="21"/>
               </w:rPr>
-              <w:t>加密、存储、权限或校验异常</w:t>
+              <w:t>上传、共享、下载、撤销或删除异常</w:t>
             </w:r>
           </w:p>
         </w:tc>

</xml_diff>